<commit_message>
Put the institutional addresses on the title page
The corresponding author's email appears in the published article, so it had
to be the institutional one rather than the personal address that stood in for
it. The other two co-authors are listed with theirs as well: the guide asks
only for the corresponding author, but the submission form asks for everyone,
and having them in one place saves looking them up twice.

The anonymisation check now also refuses any "@" in the anonymized manuscript,
so an address cannot reach the file a reviewer opens.

Co-Authored-By: Claude Opus 5 <noreply@anthropic.com>
Claude-Session: https://claude.ai/code/session_01RDiLAjvncdWAERDs1TJN4i
</commit_message>
<xml_diff>
--- a/paper/submission/title_page.docx
+++ b/paper/submission/title_page.docx
@@ -226,7 +226,61 @@
           <w:sz w:val="21"/>
           <w:szCs w:val="21"/>
         </w:rPr>
-        <w:t xml:space="preserve">Mohamed Ala Eddine Bahri, INSIGHT Lab, ISITCom, University of Sousse, Hammam Sousse 4011, Tunisia. Email: arabosaiorganisation@gmail.com.</w:t>
+        <w:t xml:space="preserve">Mohamed Ala Eddine Bahri, INSIGHT Lab, ISITCom, University of Sousse, Hammam Sousse 4011, Tunisia. Email: bahri.mohamedalaeddine@isitc.u-sousse.tn.</w:t>
+      </w:r>
+    </w:p>
+    <w:p>
+      <w:pPr>
+        <w:spacing w:after="200" w:line="276"/>
+        <w:jc w:val="both"/>
+      </w:pPr>
+      <w:r>
+        <w:rPr>
+          <w:rFonts w:ascii="Times New Roman" w:cs="Times New Roman" w:eastAsia="Times New Roman" w:hAnsi="Times New Roman"/>
+          <w:b w:val="false"/>
+          <w:bCs w:val="false"/>
+          <w:i w:val="false"/>
+          <w:iCs w:val="false"/>
+          <w:sz w:val="21"/>
+          <w:szCs w:val="21"/>
+        </w:rPr>
+        <w:t xml:space="preserve"/>
+      </w:r>
+    </w:p>
+    <w:p>
+      <w:pPr>
+        <w:spacing w:after="200" w:line="276"/>
+        <w:jc w:val="both"/>
+      </w:pPr>
+      <w:r>
+        <w:rPr>
+          <w:rFonts w:ascii="Times New Roman" w:cs="Times New Roman" w:eastAsia="Times New Roman" w:hAnsi="Times New Roman"/>
+          <w:b w:val="false"/>
+          <w:bCs w:val="false"/>
+          <w:i w:val="false"/>
+          <w:iCs w:val="false"/>
+          <w:sz w:val="21"/>
+          <w:szCs w:val="21"/>
+        </w:rPr>
+        <w:t xml:space="preserve">Author email addresses</w:t>
+      </w:r>
+    </w:p>
+    <w:p>
+      <w:pPr>
+        <w:spacing w:after="200" w:line="276"/>
+        <w:jc w:val="both"/>
+      </w:pPr>
+      <w:r>
+        <w:rPr>
+          <w:rFonts w:ascii="Times New Roman" w:cs="Times New Roman" w:eastAsia="Times New Roman" w:hAnsi="Times New Roman"/>
+          <w:b w:val="false"/>
+          <w:bCs w:val="false"/>
+          <w:i w:val="false"/>
+          <w:iCs w:val="false"/>
+          <w:sz w:val="21"/>
+          <w:szCs w:val="21"/>
+        </w:rPr>
+        <w:t xml:space="preserve">Mohamed Ala Eddine Bahri: bahri.mohamedalaeddine@isitc.u-sousse.tn  Farah Jemili: Farah.JMILI@isitc.u-sousse.tn  Mohamed Mosbah: mohamed.mosbah@u-bordeaux.fr</w:t>
       </w:r>
     </w:p>
     <w:p>

</xml_diff>